<commit_message>
Retheme submission doc to navy/teal (matches live demo palette)
</commit_message>
<xml_diff>
--- a/submission_docs/SDOC_Elevate_Submission.docx
+++ b/submission_docs/SDOC_Elevate_Submission.docx
@@ -11,7 +11,7 @@
         <w:rPr>
           <w:b/>
           <w:bCs/>
-          <w:color w:val="C8632B"/>
+          <w:color w:val="1E5F74"/>
           <w:sz w:val="44"/>
           <w:szCs w:val="44"/>
         </w:rPr>
@@ -25,7 +25,7 @@
       </w:pPr>
       <w:r>
         <w:rPr>
-          <w:color w:val="222222"/>
+          <w:color w:val="1D2430"/>
           <w:sz w:val="26"/>
           <w:szCs w:val="26"/>
         </w:rPr>
@@ -41,7 +41,7 @@
         <w:rPr>
           <w:i/>
           <w:iCs/>
-          <w:color w:val="555555"/>
+          <w:color w:val="5B6478"/>
           <w:sz w:val="22"/>
           <w:szCs w:val="22"/>
         </w:rPr>
@@ -52,7 +52,7 @@
       <w:pPr>
         <w:pStyle w:val="Heading1"/>
         <w:pBdr>
-          <w:bottom w:val="single" w:color="C8632B" w:sz="6" w:space="4"/>
+          <w:bottom w:val="single" w:color="1E5F74" w:sz="6" w:space="4"/>
         </w:pBdr>
         <w:spacing w:after="160" w:before="320"/>
       </w:pPr>
@@ -60,7 +60,7 @@
         <w:rPr>
           <w:b/>
           <w:bCs/>
-          <w:color w:val="C8632B"/>
+          <w:color w:val="1E5F74"/>
           <w:sz w:val="30"/>
           <w:szCs w:val="30"/>
         </w:rPr>
@@ -73,7 +73,7 @@
       </w:pPr>
       <w:r>
         <w:rPr>
-          <w:color w:val="222222"/>
+          <w:color w:val="1D2430"/>
           <w:sz w:val="22"/>
           <w:szCs w:val="22"/>
         </w:rPr>
@@ -86,7 +86,7 @@
       </w:pPr>
       <w:r>
         <w:rPr>
-          <w:color w:val="222222"/>
+          <w:color w:val="1D2430"/>
           <w:sz w:val="22"/>
           <w:szCs w:val="22"/>
         </w:rPr>
@@ -99,7 +99,7 @@
       </w:pPr>
       <w:r>
         <w:rPr>
-          <w:color w:val="222222"/>
+          <w:color w:val="1D2430"/>
           <w:sz w:val="22"/>
           <w:szCs w:val="22"/>
         </w:rPr>
@@ -112,7 +112,7 @@
       </w:pPr>
       <w:r>
         <w:rPr>
-          <w:color w:val="555555"/>
+          <w:color w:val="5B6478"/>
           <w:sz w:val="22"/>
           <w:szCs w:val="22"/>
         </w:rPr>
@@ -123,7 +123,7 @@
       <w:pPr>
         <w:pStyle w:val="Heading1"/>
         <w:pBdr>
-          <w:bottom w:val="single" w:color="C8632B" w:sz="6" w:space="4"/>
+          <w:bottom w:val="single" w:color="1E5F74" w:sz="6" w:space="4"/>
         </w:pBdr>
         <w:spacing w:after="160" w:before="320"/>
       </w:pPr>
@@ -131,7 +131,7 @@
         <w:rPr>
           <w:b/>
           <w:bCs/>
-          <w:color w:val="C8632B"/>
+          <w:color w:val="1E5F74"/>
           <w:sz w:val="30"/>
           <w:szCs w:val="30"/>
         </w:rPr>
@@ -160,7 +160,7 @@
         <w:tc>
           <w:tcPr>
             <w:tcW w:type="dxa" w:w="2340"/>
-            <w:shd w:fill="FBEEE2" w:val="clear"/>
+            <w:shd w:fill="E4EEF0" w:val="clear"/>
             <w:tcMar>
               <w:top w:type="dxa" w:w="160"/>
               <w:left w:type="dxa" w:w="120"/>
@@ -177,7 +177,7 @@
               <w:rPr>
                 <w:b/>
                 <w:bCs/>
-                <w:color w:val="C8632B"/>
+                <w:color w:val="1E5F74"/>
                 <w:sz w:val="30"/>
                 <w:szCs w:val="30"/>
               </w:rPr>
@@ -190,7 +190,7 @@
             </w:pPr>
             <w:r>
               <w:rPr>
-                <w:color w:val="555555"/>
+                <w:color w:val="5B6478"/>
                 <w:sz w:val="18"/>
                 <w:szCs w:val="18"/>
               </w:rPr>
@@ -201,7 +201,7 @@
         <w:tc>
           <w:tcPr>
             <w:tcW w:type="dxa" w:w="2340"/>
-            <w:shd w:fill="FBEEE2" w:val="clear"/>
+            <w:shd w:fill="E4EEF0" w:val="clear"/>
             <w:tcMar>
               <w:top w:type="dxa" w:w="160"/>
               <w:left w:type="dxa" w:w="120"/>
@@ -218,7 +218,7 @@
               <w:rPr>
                 <w:b/>
                 <w:bCs/>
-                <w:color w:val="C8632B"/>
+                <w:color w:val="1E5F74"/>
                 <w:sz w:val="30"/>
                 <w:szCs w:val="30"/>
               </w:rPr>
@@ -231,7 +231,7 @@
             </w:pPr>
             <w:r>
               <w:rPr>
-                <w:color w:val="555555"/>
+                <w:color w:val="5B6478"/>
                 <w:sz w:val="18"/>
                 <w:szCs w:val="18"/>
               </w:rPr>
@@ -242,7 +242,7 @@
         <w:tc>
           <w:tcPr>
             <w:tcW w:type="dxa" w:w="2340"/>
-            <w:shd w:fill="FBEEE2" w:val="clear"/>
+            <w:shd w:fill="E4EEF0" w:val="clear"/>
             <w:tcMar>
               <w:top w:type="dxa" w:w="160"/>
               <w:left w:type="dxa" w:w="120"/>
@@ -259,7 +259,7 @@
               <w:rPr>
                 <w:b/>
                 <w:bCs/>
-                <w:color w:val="C8632B"/>
+                <w:color w:val="1E5F74"/>
                 <w:sz w:val="30"/>
                 <w:szCs w:val="30"/>
               </w:rPr>
@@ -272,7 +272,7 @@
             </w:pPr>
             <w:r>
               <w:rPr>
-                <w:color w:val="555555"/>
+                <w:color w:val="5B6478"/>
                 <w:sz w:val="18"/>
                 <w:szCs w:val="18"/>
               </w:rPr>
@@ -283,7 +283,7 @@
         <w:tc>
           <w:tcPr>
             <w:tcW w:type="dxa" w:w="2340"/>
-            <w:shd w:fill="FBEEE2" w:val="clear"/>
+            <w:shd w:fill="E4EEF0" w:val="clear"/>
             <w:tcMar>
               <w:top w:type="dxa" w:w="160"/>
               <w:left w:type="dxa" w:w="120"/>
@@ -300,7 +300,7 @@
               <w:rPr>
                 <w:b/>
                 <w:bCs/>
-                <w:color w:val="C8632B"/>
+                <w:color w:val="1E5F74"/>
                 <w:sz w:val="30"/>
                 <w:szCs w:val="30"/>
               </w:rPr>
@@ -313,7 +313,7 @@
             </w:pPr>
             <w:r>
               <w:rPr>
-                <w:color w:val="555555"/>
+                <w:color w:val="5B6478"/>
                 <w:sz w:val="18"/>
                 <w:szCs w:val="18"/>
               </w:rPr>
@@ -336,7 +336,7 @@
         <w:rPr>
           <w:i/>
           <w:iCs/>
-          <w:color w:val="555555"/>
+          <w:color w:val="5B6478"/>
           <w:sz w:val="22"/>
           <w:szCs w:val="22"/>
         </w:rPr>
@@ -347,7 +347,7 @@
       <w:pPr>
         <w:pStyle w:val="Heading1"/>
         <w:pBdr>
-          <w:bottom w:val="single" w:color="C8632B" w:sz="6" w:space="4"/>
+          <w:bottom w:val="single" w:color="1E5F74" w:sz="6" w:space="4"/>
         </w:pBdr>
         <w:spacing w:after="160" w:before="320"/>
       </w:pPr>
@@ -355,7 +355,7 @@
         <w:rPr>
           <w:b/>
           <w:bCs/>
-          <w:color w:val="C8632B"/>
+          <w:color w:val="1E5F74"/>
           <w:sz w:val="30"/>
           <w:szCs w:val="30"/>
         </w:rPr>
@@ -373,7 +373,7 @@
       </w:pPr>
       <w:r>
         <w:rPr>
-          <w:color w:val="222222"/>
+          <w:color w:val="1D2430"/>
           <w:sz w:val="22"/>
           <w:szCs w:val="22"/>
         </w:rPr>
@@ -391,7 +391,7 @@
       </w:pPr>
       <w:r>
         <w:rPr>
-          <w:color w:val="222222"/>
+          <w:color w:val="1D2430"/>
           <w:sz w:val="22"/>
           <w:szCs w:val="22"/>
         </w:rPr>
@@ -409,7 +409,7 @@
       </w:pPr>
       <w:r>
         <w:rPr>
-          <w:color w:val="222222"/>
+          <w:color w:val="1D2430"/>
           <w:sz w:val="22"/>
           <w:szCs w:val="22"/>
         </w:rPr>
@@ -427,7 +427,7 @@
       </w:pPr>
       <w:r>
         <w:rPr>
-          <w:color w:val="222222"/>
+          <w:color w:val="1D2430"/>
           <w:sz w:val="22"/>
           <w:szCs w:val="22"/>
         </w:rPr>
@@ -438,7 +438,7 @@
       <w:pPr>
         <w:pStyle w:val="Heading1"/>
         <w:pBdr>
-          <w:bottom w:val="single" w:color="C8632B" w:sz="6" w:space="4"/>
+          <w:bottom w:val="single" w:color="1E5F74" w:sz="6" w:space="4"/>
         </w:pBdr>
         <w:spacing w:after="160" w:before="320"/>
       </w:pPr>
@@ -446,7 +446,7 @@
         <w:rPr>
           <w:b/>
           <w:bCs/>
-          <w:color w:val="C8632B"/>
+          <w:color w:val="1E5F74"/>
           <w:sz w:val="30"/>
           <w:szCs w:val="30"/>
         </w:rPr>
@@ -466,7 +466,7 @@
         <w:rPr>
           <w:b/>
           <w:bCs/>
-          <w:color w:val="222222"/>
+          <w:color w:val="1D2430"/>
           <w:sz w:val="22"/>
           <w:szCs w:val="22"/>
         </w:rPr>
@@ -474,7 +474,7 @@
       </w:r>
       <w:r>
         <w:rPr>
-          <w:color w:val="222222"/>
+          <w:color w:val="1D2430"/>
           <w:sz w:val="22"/>
           <w:szCs w:val="22"/>
         </w:rPr>
@@ -494,7 +494,7 @@
         <w:rPr>
           <w:b/>
           <w:bCs/>
-          <w:color w:val="222222"/>
+          <w:color w:val="1D2430"/>
           <w:sz w:val="22"/>
           <w:szCs w:val="22"/>
         </w:rPr>
@@ -502,7 +502,7 @@
       </w:r>
       <w:r>
         <w:rPr>
-          <w:color w:val="222222"/>
+          <w:color w:val="1D2430"/>
           <w:sz w:val="22"/>
           <w:szCs w:val="22"/>
         </w:rPr>
@@ -522,7 +522,7 @@
         <w:rPr>
           <w:b/>
           <w:bCs/>
-          <w:color w:val="222222"/>
+          <w:color w:val="1D2430"/>
           <w:sz w:val="22"/>
           <w:szCs w:val="22"/>
         </w:rPr>
@@ -530,7 +530,7 @@
       </w:r>
       <w:r>
         <w:rPr>
-          <w:color w:val="222222"/>
+          <w:color w:val="1D2430"/>
           <w:sz w:val="22"/>
           <w:szCs w:val="22"/>
         </w:rPr>
@@ -550,7 +550,7 @@
         <w:rPr>
           <w:b/>
           <w:bCs/>
-          <w:color w:val="222222"/>
+          <w:color w:val="1D2430"/>
           <w:sz w:val="22"/>
           <w:szCs w:val="22"/>
         </w:rPr>
@@ -558,7 +558,7 @@
       </w:r>
       <w:r>
         <w:rPr>
-          <w:color w:val="222222"/>
+          <w:color w:val="1D2430"/>
           <w:sz w:val="22"/>
           <w:szCs w:val="22"/>
         </w:rPr>
@@ -569,7 +569,7 @@
       <w:pPr>
         <w:pStyle w:val="Heading1"/>
         <w:pBdr>
-          <w:bottom w:val="single" w:color="C8632B" w:sz="6" w:space="4"/>
+          <w:bottom w:val="single" w:color="1E5F74" w:sz="6" w:space="4"/>
         </w:pBdr>
         <w:spacing w:after="160" w:before="320"/>
       </w:pPr>
@@ -577,7 +577,7 @@
         <w:rPr>
           <w:b/>
           <w:bCs/>
-          <w:color w:val="C8632B"/>
+          <w:color w:val="1E5F74"/>
           <w:sz w:val="30"/>
           <w:szCs w:val="30"/>
         </w:rPr>
@@ -597,7 +597,7 @@
         <w:rPr>
           <w:b/>
           <w:bCs/>
-          <w:color w:val="222222"/>
+          <w:color w:val="1D2430"/>
           <w:sz w:val="22"/>
           <w:szCs w:val="22"/>
         </w:rPr>
@@ -605,7 +605,7 @@
       </w:r>
       <w:r>
         <w:rPr>
-          <w:color w:val="222222"/>
+          <w:color w:val="1D2430"/>
           <w:sz w:val="22"/>
           <w:szCs w:val="22"/>
         </w:rPr>
@@ -625,7 +625,7 @@
         <w:rPr>
           <w:b/>
           <w:bCs/>
-          <w:color w:val="222222"/>
+          <w:color w:val="1D2430"/>
           <w:sz w:val="22"/>
           <w:szCs w:val="22"/>
         </w:rPr>
@@ -633,7 +633,7 @@
       </w:r>
       <w:r>
         <w:rPr>
-          <w:color w:val="222222"/>
+          <w:color w:val="1D2430"/>
           <w:sz w:val="22"/>
           <w:szCs w:val="22"/>
         </w:rPr>
@@ -653,7 +653,7 @@
         <w:rPr>
           <w:b/>
           <w:bCs/>
-          <w:color w:val="222222"/>
+          <w:color w:val="1D2430"/>
           <w:sz w:val="22"/>
           <w:szCs w:val="22"/>
         </w:rPr>
@@ -661,7 +661,7 @@
       </w:r>
       <w:r>
         <w:rPr>
-          <w:color w:val="222222"/>
+          <w:color w:val="1D2430"/>
           <w:sz w:val="22"/>
           <w:szCs w:val="22"/>
         </w:rPr>
@@ -681,7 +681,7 @@
         <w:rPr>
           <w:b/>
           <w:bCs/>
-          <w:color w:val="222222"/>
+          <w:color w:val="1D2430"/>
           <w:sz w:val="22"/>
           <w:szCs w:val="22"/>
         </w:rPr>
@@ -689,7 +689,7 @@
       </w:r>
       <w:r>
         <w:rPr>
-          <w:color w:val="222222"/>
+          <w:color w:val="1D2430"/>
           <w:sz w:val="22"/>
           <w:szCs w:val="22"/>
         </w:rPr>
@@ -700,7 +700,7 @@
       <w:pPr>
         <w:pStyle w:val="Heading1"/>
         <w:pBdr>
-          <w:bottom w:val="single" w:color="C8632B" w:sz="6" w:space="4"/>
+          <w:bottom w:val="single" w:color="1E5F74" w:sz="6" w:space="4"/>
         </w:pBdr>
         <w:spacing w:after="160" w:before="320"/>
       </w:pPr>
@@ -708,7 +708,7 @@
         <w:rPr>
           <w:b/>
           <w:bCs/>
-          <w:color w:val="C8632B"/>
+          <w:color w:val="1E5F74"/>
           <w:sz w:val="30"/>
           <w:szCs w:val="30"/>
         </w:rPr>
@@ -726,7 +726,7 @@
       </w:pPr>
       <w:r>
         <w:rPr>
-          <w:color w:val="222222"/>
+          <w:color w:val="1D2430"/>
           <w:sz w:val="22"/>
           <w:szCs w:val="22"/>
         </w:rPr>
@@ -744,7 +744,7 @@
       </w:pPr>
       <w:r>
         <w:rPr>
-          <w:color w:val="222222"/>
+          <w:color w:val="1D2430"/>
           <w:sz w:val="22"/>
           <w:szCs w:val="22"/>
         </w:rPr>
@@ -762,7 +762,7 @@
       </w:pPr>
       <w:r>
         <w:rPr>
-          <w:color w:val="222222"/>
+          <w:color w:val="1D2430"/>
           <w:sz w:val="22"/>
           <w:szCs w:val="22"/>
         </w:rPr>

</xml_diff>

<commit_message>
Document AI Integration (Claude Code-built) and Cloud Infrastructure (GitHub/GitHub Pages) to satisfy hackathon requirements
</commit_message>
<xml_diff>
--- a/submission_docs/SDOC_Elevate_Submission.docx
+++ b/submission_docs/SDOC_Elevate_Submission.docx
@@ -117,6 +117,81 @@
           <w:szCs w:val="22"/>
         </w:rPr>
         <w:t xml:space="preserve">GitHub: https://github.com/iban-1/AverisXHackathon</w:t>
+      </w:r>
+    </w:p>
+    <w:p>
+      <w:pPr>
+        <w:pStyle w:val="Heading1"/>
+        <w:pBdr>
+          <w:bottom w:val="single" w:color="1E5F74" w:sz="6" w:space="4"/>
+        </w:pBdr>
+        <w:spacing w:after="160" w:before="320"/>
+      </w:pPr>
+      <w:r>
+        <w:rPr>
+          <w:b/>
+          <w:bCs/>
+          <w:color w:val="1E5F74"/>
+          <w:sz w:val="30"/>
+          <w:szCs w:val="30"/>
+        </w:rPr>
+        <w:t xml:space="preserve">AI &amp; Cloud Integration</w:t>
+      </w:r>
+    </w:p>
+    <w:p>
+      <w:pPr>
+        <w:pStyle w:val="ListParagraph"/>
+        <w:numPr>
+          <w:ilvl w:val="0"/>
+          <w:numId w:val="2"/>
+        </w:numPr>
+        <w:spacing w:after="80"/>
+      </w:pPr>
+      <w:r>
+        <w:rPr>
+          <w:b/>
+          <w:bCs/>
+          <w:color w:val="1D2430"/>
+          <w:sz w:val="22"/>
+          <w:szCs w:val="22"/>
+        </w:rPr>
+        <w:t xml:space="preserve">AI Integration: </w:t>
+      </w:r>
+      <w:r>
+        <w:rPr>
+          <w:color w:val="1D2430"/>
+          <w:sz w:val="22"/>
+          <w:szCs w:val="22"/>
+        </w:rPr>
+        <w:t xml:space="preserve">this solution was built end-to-end using Claude Code, Anthropic's AI coding agent, as the core development tool — not a peripheral aid. Every module (classify.py, extract.py, synonyms.py, compare.py, pipeline.py), the 40-test suite validated against the real dataset, the JavaScript port of the pipeline powering the live demo, and this documentation were designed, implemented, debugged, and iterated end-to-end through an AI-assisted engineering workflow.</w:t>
+      </w:r>
+    </w:p>
+    <w:p>
+      <w:pPr>
+        <w:pStyle w:val="ListParagraph"/>
+        <w:numPr>
+          <w:ilvl w:val="0"/>
+          <w:numId w:val="2"/>
+        </w:numPr>
+        <w:spacing w:after="80"/>
+      </w:pPr>
+      <w:r>
+        <w:rPr>
+          <w:b/>
+          <w:bCs/>
+          <w:color w:val="1D2430"/>
+          <w:sz w:val="22"/>
+          <w:szCs w:val="22"/>
+        </w:rPr>
+        <w:t xml:space="preserve">Cloud Infrastructure: </w:t>
+      </w:r>
+      <w:r>
+        <w:rPr>
+          <w:color w:val="1D2430"/>
+          <w:sz w:val="22"/>
+          <w:szCs w:val="22"/>
+        </w:rPr>
+        <w:t xml:space="preserve">the project is hosted and deployed on cloud infrastructure throughout — source control on GitHub (cloud-hosted git), and the live prototype served via GitHub Pages (GitHub's cloud hosting/CDN) at https://iban-1.github.io/AverisXHackathon/, publicly accessible with no local server required.</w:t>
       </w:r>
     </w:p>
     <w:p>

</xml_diff>